<commit_message>
docs: add comprehensive team orientation guide and update project documentation to reflect recent UI and CI changes
</commit_message>
<xml_diff>
--- a/docs/team-guide/Vol-1-Orientation.docx
+++ b/docs/team-guide/Vol-1-Orientation.docx
@@ -9,7 +9,7 @@
           <w:rFonts w:eastAsia="Times New Roman"/>
         </w:rPr>
       </w:pPr>
-      <w:bookmarkStart w:id="0" w:name="_Toc239168747"/>
+      <w:bookmarkStart w:id="0" w:name="_Toc239543367"/>
       <w:r>
         <w:rPr>
           <w:rFonts w:eastAsia="Times New Roman"/>
@@ -49,7 +49,7 @@
         <w:rPr>
           <w:rStyle w:val="HTMLCode"/>
         </w:rPr>
-        <w:t>57e6261</w:t>
+        <w:t>eca7dee</w:t>
       </w:r>
       <w:r>
         <w:rPr>
@@ -67,13 +67,13 @@
         <w:rPr>
           <w:rFonts w:ascii="Segoe UI" w:hAnsi="Segoe UI" w:cs="Segoe UI"/>
         </w:rPr>
-        <w:t xml:space="preserve">  ·  written 1 September 2026  ·  Volume 1 of 5</w:t>
+        <w:t xml:space="preserve">  ·  written 1 September 2026, revised 5 September 2026  ·  Volume 1 of 5</w:t>
       </w:r>
     </w:p>
     <w:p>
       <w:pPr>
         <w:shd w:val="clear" w:color="auto" w:fill="F7F9FC"/>
-        <w:divId w:val="859856395"/>
+        <w:divId w:val="184952859"/>
         <w:rPr>
           <w:rFonts w:ascii="Segoe UI" w:eastAsia="Times New Roman" w:hAnsi="Segoe UI" w:cs="Segoe UI"/>
           <w:color w:val="1A1A1A"/>
@@ -307,7 +307,7 @@
         <w:rPr>
           <w:noProof/>
         </w:rPr>
-        <w:instrText xml:space="preserve"> PAGEREF _Toc239168747 \h </w:instrText>
+        <w:instrText xml:space="preserve"> PAGEREF _Toc239543367 \h </w:instrText>
       </w:r>
       <w:r>
         <w:rPr>
@@ -369,7 +369,7 @@
         <w:rPr>
           <w:noProof/>
         </w:rPr>
-        <w:instrText xml:space="preserve"> PAGEREF _Toc239168748 \h </w:instrText>
+        <w:instrText xml:space="preserve"> PAGEREF _Toc239543368 \h </w:instrText>
       </w:r>
       <w:r>
         <w:rPr>
@@ -431,7 +431,7 @@
         <w:rPr>
           <w:noProof/>
         </w:rPr>
-        <w:instrText xml:space="preserve"> PAGEREF _Toc239168749 \h </w:instrText>
+        <w:instrText xml:space="preserve"> PAGEREF _Toc239543369 \h </w:instrText>
       </w:r>
       <w:r>
         <w:rPr>
@@ -493,7 +493,7 @@
         <w:rPr>
           <w:noProof/>
         </w:rPr>
-        <w:instrText xml:space="preserve"> PAGEREF _Toc239168750 \h </w:instrText>
+        <w:instrText xml:space="preserve"> PAGEREF _Toc239543370 \h </w:instrText>
       </w:r>
       <w:r>
         <w:rPr>
@@ -555,7 +555,7 @@
         <w:rPr>
           <w:noProof/>
         </w:rPr>
-        <w:instrText xml:space="preserve"> PAGEREF _Toc239168751 \h </w:instrText>
+        <w:instrText xml:space="preserve"> PAGEREF _Toc239543371 \h </w:instrText>
       </w:r>
       <w:r>
         <w:rPr>
@@ -617,7 +617,7 @@
         <w:rPr>
           <w:noProof/>
         </w:rPr>
-        <w:instrText xml:space="preserve"> PAGEREF _Toc239168752 \h </w:instrText>
+        <w:instrText xml:space="preserve"> PAGEREF _Toc239543372 \h </w:instrText>
       </w:r>
       <w:r>
         <w:rPr>
@@ -679,7 +679,7 @@
         <w:rPr>
           <w:noProof/>
         </w:rPr>
-        <w:instrText xml:space="preserve"> PAGEREF _Toc239168753 \h </w:instrText>
+        <w:instrText xml:space="preserve"> PAGEREF _Toc239543373 \h </w:instrText>
       </w:r>
       <w:r>
         <w:rPr>
@@ -741,7 +741,7 @@
         <w:rPr>
           <w:noProof/>
         </w:rPr>
-        <w:instrText xml:space="preserve"> PAGEREF _Toc239168754 \h </w:instrText>
+        <w:instrText xml:space="preserve"> PAGEREF _Toc239543374 \h </w:instrText>
       </w:r>
       <w:r>
         <w:rPr>
@@ -803,7 +803,7 @@
         <w:rPr>
           <w:noProof/>
         </w:rPr>
-        <w:instrText xml:space="preserve"> PAGEREF _Toc239168755 \h </w:instrText>
+        <w:instrText xml:space="preserve"> PAGEREF _Toc239543375 \h </w:instrText>
       </w:r>
       <w:r>
         <w:rPr>
@@ -865,7 +865,7 @@
         <w:rPr>
           <w:noProof/>
         </w:rPr>
-        <w:instrText xml:space="preserve"> PAGEREF _Toc239168756 \h </w:instrText>
+        <w:instrText xml:space="preserve"> PAGEREF _Toc239543376 \h </w:instrText>
       </w:r>
       <w:r>
         <w:rPr>
@@ -927,7 +927,7 @@
         <w:rPr>
           <w:noProof/>
         </w:rPr>
-        <w:instrText xml:space="preserve"> PAGEREF _Toc239168757 \h </w:instrText>
+        <w:instrText xml:space="preserve"> PAGEREF _Toc239543377 \h </w:instrText>
       </w:r>
       <w:r>
         <w:rPr>
@@ -989,7 +989,7 @@
         <w:rPr>
           <w:noProof/>
         </w:rPr>
-        <w:instrText xml:space="preserve"> PAGEREF _Toc239168758 \h </w:instrText>
+        <w:instrText xml:space="preserve"> PAGEREF _Toc239543378 \h </w:instrText>
       </w:r>
       <w:r>
         <w:rPr>
@@ -1051,7 +1051,7 @@
         <w:rPr>
           <w:noProof/>
         </w:rPr>
-        <w:instrText xml:space="preserve"> PAGEREF _Toc239168759 \h </w:instrText>
+        <w:instrText xml:space="preserve"> PAGEREF _Toc239543379 \h </w:instrText>
       </w:r>
       <w:r>
         <w:rPr>
@@ -1113,7 +1113,7 @@
         <w:rPr>
           <w:noProof/>
         </w:rPr>
-        <w:instrText xml:space="preserve"> PAGEREF _Toc239168760 \h </w:instrText>
+        <w:instrText xml:space="preserve"> PAGEREF _Toc239543380 \h </w:instrText>
       </w:r>
       <w:r>
         <w:rPr>
@@ -1175,7 +1175,7 @@
         <w:rPr>
           <w:noProof/>
         </w:rPr>
-        <w:instrText xml:space="preserve"> PAGEREF _Toc239168761 \h </w:instrText>
+        <w:instrText xml:space="preserve"> PAGEREF _Toc239543381 \h </w:instrText>
       </w:r>
       <w:r>
         <w:rPr>
@@ -1237,7 +1237,7 @@
         <w:rPr>
           <w:noProof/>
         </w:rPr>
-        <w:instrText xml:space="preserve"> PAGEREF _Toc239168762 \h </w:instrText>
+        <w:instrText xml:space="preserve"> PAGEREF _Toc239543382 \h </w:instrText>
       </w:r>
       <w:r>
         <w:rPr>
@@ -1299,7 +1299,7 @@
         <w:rPr>
           <w:noProof/>
         </w:rPr>
-        <w:instrText xml:space="preserve"> PAGEREF _Toc239168763 \h </w:instrText>
+        <w:instrText xml:space="preserve"> PAGEREF _Toc239543383 \h </w:instrText>
       </w:r>
       <w:r>
         <w:rPr>
@@ -1352,7 +1352,7 @@
           <w:rFonts w:eastAsia="Times New Roman"/>
         </w:rPr>
       </w:pPr>
-      <w:bookmarkStart w:id="1" w:name="_Toc239168748"/>
+      <w:bookmarkStart w:id="1" w:name="_Toc239543368"/>
       <w:r>
         <w:rPr>
           <w:rFonts w:eastAsia="Times New Roman"/>
@@ -1404,7 +1404,7 @@
           <w:rFonts w:eastAsia="Times New Roman"/>
         </w:rPr>
       </w:pPr>
-      <w:bookmarkStart w:id="2" w:name="_Toc239168749"/>
+      <w:bookmarkStart w:id="2" w:name="_Toc239543369"/>
       <w:r>
         <w:rPr>
           <w:rFonts w:eastAsia="Times New Roman"/>
@@ -1516,7 +1516,7 @@
     <w:p>
       <w:pPr>
         <w:shd w:val="clear" w:color="auto" w:fill="F7F9FC"/>
-        <w:divId w:val="2012828214"/>
+        <w:divId w:val="732121768"/>
         <w:rPr>
           <w:rFonts w:ascii="Segoe UI" w:eastAsia="Times New Roman" w:hAnsi="Segoe UI" w:cs="Segoe UI"/>
           <w:color w:val="1A1A1A"/>
@@ -1709,7 +1709,7 @@
           <w:rFonts w:eastAsia="Times New Roman"/>
         </w:rPr>
       </w:pPr>
-      <w:bookmarkStart w:id="3" w:name="_Toc239168750"/>
+      <w:bookmarkStart w:id="3" w:name="_Toc239543370"/>
       <w:r>
         <w:rPr>
           <w:rFonts w:eastAsia="Times New Roman"/>
@@ -1780,7 +1780,7 @@
           <w:rFonts w:eastAsia="Times New Roman"/>
         </w:rPr>
       </w:pPr>
-      <w:bookmarkStart w:id="4" w:name="_Toc239168751"/>
+      <w:bookmarkStart w:id="4" w:name="_Toc239543371"/>
       <w:r>
         <w:rPr>
           <w:rFonts w:eastAsia="Times New Roman"/>
@@ -1829,7 +1829,7 @@
         </w:rPr>
         <w:lastRenderedPageBreak/>
         <w:drawing>
-          <wp:inline distT="0" distB="0" distL="0" distR="0" wp14:anchorId="3DCA373F" wp14:editId="42EC903E">
+          <wp:inline distT="0" distB="0" distL="0" distR="0" wp14:anchorId="72397E29" wp14:editId="052FC060">
             <wp:extent cx="5969000" cy="6506210"/>
             <wp:effectExtent l="0" t="0" r="0" b="8890"/>
             <wp:docPr id="1" name="Picture 1"/>
@@ -1919,7 +1919,7 @@
     <w:p>
       <w:pPr>
         <w:shd w:val="clear" w:color="auto" w:fill="FFF8E8"/>
-        <w:divId w:val="287668759"/>
+        <w:divId w:val="845512349"/>
         <w:rPr>
           <w:rFonts w:ascii="Segoe UI" w:eastAsia="Times New Roman" w:hAnsi="Segoe UI" w:cs="Segoe UI"/>
           <w:color w:val="1A1A1A"/>
@@ -2203,7 +2203,7 @@
           <w:rFonts w:eastAsia="Times New Roman"/>
         </w:rPr>
       </w:pPr>
-      <w:bookmarkStart w:id="5" w:name="_Toc239168752"/>
+      <w:bookmarkStart w:id="5" w:name="_Toc239543372"/>
       <w:r>
         <w:rPr>
           <w:rFonts w:eastAsia="Times New Roman"/>
@@ -3798,7 +3798,7 @@
           <w:rFonts w:eastAsia="Times New Roman"/>
         </w:rPr>
       </w:pPr>
-      <w:bookmarkStart w:id="6" w:name="_Toc239168753"/>
+      <w:bookmarkStart w:id="6" w:name="_Toc239543373"/>
       <w:r>
         <w:rPr>
           <w:rFonts w:eastAsia="Times New Roman"/>
@@ -3896,7 +3896,7 @@
     <w:p>
       <w:pPr>
         <w:shd w:val="clear" w:color="auto" w:fill="F7F9FC"/>
-        <w:divId w:val="199753830"/>
+        <w:divId w:val="570962540"/>
         <w:rPr>
           <w:rFonts w:ascii="Segoe UI" w:eastAsia="Times New Roman" w:hAnsi="Segoe UI" w:cs="Segoe UI"/>
           <w:color w:val="1A1A1A"/>
@@ -3947,7 +3947,7 @@
           <w:rFonts w:eastAsia="Times New Roman"/>
         </w:rPr>
       </w:pPr>
-      <w:bookmarkStart w:id="7" w:name="_Toc239168754"/>
+      <w:bookmarkStart w:id="7" w:name="_Toc239543374"/>
       <w:r>
         <w:rPr>
           <w:rFonts w:eastAsia="Times New Roman"/>
@@ -3975,7 +3975,7 @@
           <w:szCs w:val="22"/>
         </w:rPr>
         <w:drawing>
-          <wp:inline distT="0" distB="0" distL="0" distR="0" wp14:anchorId="1605C01F" wp14:editId="43E1A7BB">
+          <wp:inline distT="0" distB="0" distL="0" distR="0" wp14:anchorId="6C3409D3" wp14:editId="180B5104">
             <wp:extent cx="5969000" cy="4536440"/>
             <wp:effectExtent l="0" t="0" r="0" b="0"/>
             <wp:docPr id="2" name="Picture 2"/>
@@ -4132,7 +4132,7 @@
     <w:p>
       <w:pPr>
         <w:shd w:val="clear" w:color="auto" w:fill="FFF8E8"/>
-        <w:divId w:val="1217160973"/>
+        <w:divId w:val="1649163847"/>
         <w:rPr>
           <w:rFonts w:ascii="Segoe UI" w:eastAsia="Times New Roman" w:hAnsi="Segoe UI" w:cs="Segoe UI"/>
           <w:color w:val="1A1A1A"/>
@@ -4351,7 +4351,7 @@
           <w:rFonts w:eastAsia="Times New Roman"/>
         </w:rPr>
       </w:pPr>
-      <w:bookmarkStart w:id="8" w:name="_Toc239168755"/>
+      <w:bookmarkStart w:id="8" w:name="_Toc239543375"/>
       <w:r>
         <w:rPr>
           <w:rFonts w:eastAsia="Times New Roman"/>
@@ -4477,7 +4477,7 @@
     <w:p>
       <w:pPr>
         <w:shd w:val="clear" w:color="auto" w:fill="FFF4F4"/>
-        <w:divId w:val="641354346"/>
+        <w:divId w:val="401489926"/>
         <w:rPr>
           <w:rFonts w:ascii="Segoe UI" w:eastAsia="Times New Roman" w:hAnsi="Segoe UI" w:cs="Segoe UI"/>
           <w:color w:val="1A1A1A"/>
@@ -4548,7 +4548,7 @@
           <w:rFonts w:eastAsia="Times New Roman"/>
         </w:rPr>
       </w:pPr>
-      <w:bookmarkStart w:id="9" w:name="_Toc239168756"/>
+      <w:bookmarkStart w:id="9" w:name="_Toc239543376"/>
       <w:r>
         <w:rPr>
           <w:rFonts w:eastAsia="Times New Roman"/>
@@ -4597,7 +4597,7 @@
         </w:rPr>
         <w:lastRenderedPageBreak/>
         <w:drawing>
-          <wp:inline distT="0" distB="0" distL="0" distR="0" wp14:anchorId="4BA78965" wp14:editId="2A9C291B">
+          <wp:inline distT="0" distB="0" distL="0" distR="0" wp14:anchorId="2C54E88D" wp14:editId="73DD9E35">
             <wp:extent cx="5969000" cy="5551170"/>
             <wp:effectExtent l="0" t="0" r="0" b="0"/>
             <wp:docPr id="3" name="Picture 3"/>
@@ -4667,7 +4667,7 @@
           <w:rFonts w:eastAsia="Times New Roman"/>
         </w:rPr>
       </w:pPr>
-      <w:bookmarkStart w:id="10" w:name="_Toc239168757"/>
+      <w:bookmarkStart w:id="10" w:name="_Toc239543377"/>
       <w:r>
         <w:rPr>
           <w:rFonts w:eastAsia="Times New Roman"/>
@@ -5039,7 +5039,7 @@
           <w:rFonts w:eastAsia="Times New Roman"/>
         </w:rPr>
       </w:pPr>
-      <w:bookmarkStart w:id="11" w:name="_Toc239168758"/>
+      <w:bookmarkStart w:id="11" w:name="_Toc239543378"/>
       <w:r>
         <w:rPr>
           <w:rFonts w:eastAsia="Times New Roman"/>
@@ -5646,7 +5646,7 @@
     <w:p>
       <w:pPr>
         <w:shd w:val="clear" w:color="auto" w:fill="F7F9FC"/>
-        <w:divId w:val="1649171428"/>
+        <w:divId w:val="1146774188"/>
         <w:rPr>
           <w:rFonts w:ascii="Segoe UI" w:eastAsia="Times New Roman" w:hAnsi="Segoe UI" w:cs="Segoe UI"/>
           <w:color w:val="1A1A1A"/>
@@ -5712,7 +5712,7 @@
           <w:rFonts w:eastAsia="Times New Roman"/>
         </w:rPr>
       </w:pPr>
-      <w:bookmarkStart w:id="12" w:name="_Toc239168759"/>
+      <w:bookmarkStart w:id="12" w:name="_Toc239543379"/>
       <w:r>
         <w:rPr>
           <w:rFonts w:eastAsia="Times New Roman"/>
@@ -5776,7 +5776,7 @@
           <w:szCs w:val="22"/>
         </w:rPr>
         <w:drawing>
-          <wp:inline distT="0" distB="0" distL="0" distR="0" wp14:anchorId="68779AAE" wp14:editId="48DB92D1">
+          <wp:inline distT="0" distB="0" distL="0" distR="0" wp14:anchorId="15E3C246" wp14:editId="46959763">
             <wp:extent cx="5969000" cy="4894580"/>
             <wp:effectExtent l="0" t="0" r="0" b="1270"/>
             <wp:docPr id="4" name="Picture 4"/>
@@ -6103,7 +6103,7 @@
     <w:p>
       <w:pPr>
         <w:shd w:val="clear" w:color="auto" w:fill="FFF8E8"/>
-        <w:divId w:val="1730304676"/>
+        <w:divId w:val="309211304"/>
         <w:rPr>
           <w:rFonts w:ascii="Segoe UI" w:eastAsia="Times New Roman" w:hAnsi="Segoe UI" w:cs="Segoe UI"/>
           <w:color w:val="1A1A1A"/>
@@ -6168,16 +6168,16 @@
           <w:sz w:val="20"/>
           <w:szCs w:val="20"/>
         </w:rPr>
-        <w:t xml:space="preserve"> </w:t>
-      </w:r>
-      <w:r>
-        <w:rPr>
-          <w:rFonts w:ascii="Segoe UI" w:eastAsia="Times New Roman" w:hAnsi="Segoe UI" w:cs="Segoe UI"/>
-          <w:color w:val="1A1A1A"/>
-          <w:sz w:val="20"/>
-          <w:szCs w:val="20"/>
-        </w:rPr>
-        <w:t xml:space="preserve">prove and set this flag. A truncated test runs fewer steps than the case described — and may still report as passing. </w:t>
+        <w:t xml:space="preserve"> prove and set this flag. A truncated t</w:t>
+      </w:r>
+      <w:r>
+        <w:rPr>
+          <w:rFonts w:ascii="Segoe UI" w:eastAsia="Times New Roman" w:hAnsi="Segoe UI" w:cs="Segoe UI"/>
+          <w:color w:val="1A1A1A"/>
+          <w:sz w:val="20"/>
+          <w:szCs w:val="20"/>
+        </w:rPr>
+        <w:t xml:space="preserve">est runs fewer steps than the case described — and may still report as passing. </w:t>
       </w:r>
       <w:r>
         <w:rPr>
@@ -6202,7 +6202,7 @@
           <w:rFonts w:eastAsia="Times New Roman"/>
         </w:rPr>
       </w:pPr>
-      <w:bookmarkStart w:id="13" w:name="_Toc239168760"/>
+      <w:bookmarkStart w:id="13" w:name="_Toc239543380"/>
       <w:r>
         <w:rPr>
           <w:rFonts w:eastAsia="Times New Roman"/>
@@ -7303,7 +7303,7 @@
                 <w:szCs w:val="19"/>
               </w:rPr>
               <w:br/>
-              <w:t>4,806 lines</w:t>
+              <w:t>4,909 lines</w:t>
             </w:r>
           </w:p>
         </w:tc>
@@ -7454,7 +7454,7 @@
                 <w:sz w:val="19"/>
                 <w:szCs w:val="19"/>
               </w:rPr>
-              <w:t>350 lines</w:t>
+              <w:t>348 lines</w:t>
             </w:r>
           </w:p>
         </w:tc>
@@ -7931,7 +7931,7 @@
                 <w:sz w:val="19"/>
                 <w:szCs w:val="19"/>
               </w:rPr>
-              <w:t>51 files</w:t>
+              <w:t>52 files</w:t>
             </w:r>
           </w:p>
         </w:tc>
@@ -8036,7 +8036,7 @@
     <w:p>
       <w:pPr>
         <w:shd w:val="clear" w:color="auto" w:fill="FFF4F4"/>
-        <w:divId w:val="40986956"/>
+        <w:divId w:val="114327434"/>
         <w:rPr>
           <w:rFonts w:ascii="Segoe UI" w:eastAsia="Times New Roman" w:hAnsi="Segoe UI" w:cs="Segoe UI"/>
           <w:color w:val="1A1A1A"/>
@@ -8274,7 +8274,7 @@
           <w:rFonts w:eastAsia="Times New Roman"/>
         </w:rPr>
       </w:pPr>
-      <w:bookmarkStart w:id="14" w:name="_Toc239168761"/>
+      <w:bookmarkStart w:id="14" w:name="_Toc239543381"/>
       <w:r>
         <w:rPr>
           <w:rFonts w:eastAsia="Times New Roman"/>
@@ -9574,7 +9574,7 @@
           <w:rFonts w:eastAsia="Times New Roman"/>
         </w:rPr>
       </w:pPr>
-      <w:bookmarkStart w:id="15" w:name="_Toc239168762"/>
+      <w:bookmarkStart w:id="15" w:name="_Toc239543382"/>
       <w:r>
         <w:rPr>
           <w:rFonts w:eastAsia="Times New Roman"/>
@@ -9733,7 +9733,7 @@
     <w:p>
       <w:pPr>
         <w:shd w:val="clear" w:color="auto" w:fill="FFF4F4"/>
-        <w:divId w:val="1677465317"/>
+        <w:divId w:val="1837376540"/>
         <w:rPr>
           <w:rFonts w:ascii="Segoe UI" w:eastAsia="Times New Roman" w:hAnsi="Segoe UI" w:cs="Segoe UI"/>
           <w:color w:val="1A1A1A"/>
@@ -9924,7 +9924,7 @@
           <w:rFonts w:eastAsia="Times New Roman"/>
         </w:rPr>
       </w:pPr>
-      <w:bookmarkStart w:id="16" w:name="_Toc239168763"/>
+      <w:bookmarkStart w:id="16" w:name="_Toc239543383"/>
       <w:r>
         <w:rPr>
           <w:rFonts w:eastAsia="Times New Roman"/>
@@ -10423,9 +10423,9 @@
 <file path=word/numbering.xml><?xml version="1.0" encoding="utf-8"?>
 <w:numbering xmlns:wpc="http://schemas.microsoft.com/office/word/2010/wordprocessingCanvas" xmlns:cx="http://schemas.microsoft.com/office/drawing/2014/chartex" xmlns:cx1="http://schemas.microsoft.com/office/drawing/2015/9/8/chartex" xmlns:cx2="http://schemas.microsoft.com/office/drawing/2015/10/21/chartex" xmlns:cx3="http://schemas.microsoft.com/office/drawing/2016/5/9/chartex" xmlns:cx4="http://schemas.microsoft.com/office/drawing/2016/5/10/chartex" xmlns:cx5="http://schemas.microsoft.com/office/drawing/2016/5/11/chartex" xmlns:cx6="http://schemas.microsoft.com/office/drawing/2016/5/12/chartex" xmlns:cx7="http://schemas.microsoft.com/office/drawing/2016/5/13/chartex" xmlns:cx8="http://schemas.microsoft.com/office/drawing/2016/5/14/chartex" xmlns:mc="http://schemas.openxmlformats.org/markup-compatibility/2006" xmlns:aink="http://schemas.microsoft.com/office/drawing/2016/ink" xmlns:am3d="http://schemas.microsoft.com/office/drawing/2017/model3d" xmlns:o="urn:schemas-microsoft-com:office:office" xmlns:oel="http://schemas.microsoft.com/office/2019/extlst" xmlns:r="http://schemas.openxmlformats.org/officeDocument/2006/relationships" xmlns:m="http://schemas.openxmlformats.org/officeDocument/2006/math" xmlns:v="urn:schemas-microsoft-com:vml" xmlns:wp14="http://schemas.microsoft.com/office/word/2010/wordprocessingDrawing" xmlns:wp="http://schemas.openxmlformats.org/drawingml/2006/wordprocessingDrawing" xmlns:w10="urn:schemas-microsoft-com:office:word" xmlns:w="http://schemas.openxmlformats.org/wordprocessingml/2006/main" xmlns:w14="http://schemas.microsoft.com/office/word/2010/wordml" xmlns:w15="http://schemas.microsoft.com/office/word/2012/wordml" xmlns:w16cex="http://schemas.microsoft.com/office/word/2018/wordml/cex" xmlns:w16cid="http://schemas.microsoft.com/office/word/2016/wordml/cid" xmlns:w16="http://schemas.microsoft.com/office/word/2018/wordml" xmlns:w16du="http://schemas.microsoft.com/office/word/2023/wordml/word16du" xmlns:w16sdtdh="http://schemas.microsoft.com/office/word/2020/wordml/sdtdatahash" xmlns:w16sdtfl="http://schemas.microsoft.com/office/word/2024/wordml/sdtformatlock" xmlns:w16se="http://schemas.microsoft.com/office/word/2015/wordml/symex" xmlns:wpg="http://schemas.microsoft.com/office/word/2010/wordprocessingGroup" xmlns:wpi="http://schemas.microsoft.com/office/word/2010/wordprocessingInk" xmlns:wne="http://schemas.microsoft.com/office/word/2006/wordml" xmlns:wps="http://schemas.microsoft.com/office/word/2010/wordprocessingShape" mc:Ignorable="w14 w15 w16se w16cid w16 w16cex w16sdtdh w16sdtfl w16du wp14">
   <w:abstractNum w:abstractNumId="0" w15:restartNumberingAfterBreak="0">
-    <w:nsid w:val="08751187"/>
+    <w:nsid w:val="4D237349"/>
     <w:multiLevelType w:val="multilevel"/>
-    <w:tmpl w:val="F9665D16"/>
+    <w:tmpl w:val="30743D66"/>
     <w:lvl w:ilvl="0">
       <w:start w:val="1"/>
       <w:numFmt w:val="bullet"/>
@@ -10572,9 +10572,9 @@
     </w:lvl>
   </w:abstractNum>
   <w:abstractNum w:abstractNumId="1" w15:restartNumberingAfterBreak="0">
-    <w:nsid w:val="64EC6FB6"/>
+    <w:nsid w:val="4E94489F"/>
     <w:multiLevelType w:val="multilevel"/>
-    <w:tmpl w:val="E5465BAE"/>
+    <w:tmpl w:val="77EC0E74"/>
     <w:lvl w:ilvl="0">
       <w:start w:val="1"/>
       <w:numFmt w:val="bullet"/>
@@ -10721,9 +10721,9 @@
     </w:lvl>
   </w:abstractNum>
   <w:abstractNum w:abstractNumId="2" w15:restartNumberingAfterBreak="0">
-    <w:nsid w:val="69DB4CD9"/>
+    <w:nsid w:val="7C8551DB"/>
     <w:multiLevelType w:val="multilevel"/>
-    <w:tmpl w:val="D5A8300C"/>
+    <w:tmpl w:val="FB5EF44A"/>
     <w:lvl w:ilvl="0">
       <w:start w:val="1"/>
       <w:numFmt w:val="bullet"/>
@@ -10869,14 +10869,14 @@
       </w:rPr>
     </w:lvl>
   </w:abstractNum>
-  <w:num w:numId="1" w16cid:durableId="1098257056">
+  <w:num w:numId="1" w16cid:durableId="1845510925">
+    <w:abstractNumId w:val="1"/>
+  </w:num>
+  <w:num w:numId="2" w16cid:durableId="1873151484">
     <w:abstractNumId w:val="0"/>
   </w:num>
-  <w:num w:numId="2" w16cid:durableId="1554463884">
+  <w:num w:numId="3" w16cid:durableId="1047335753">
     <w:abstractNumId w:val="2"/>
-  </w:num>
-  <w:num w:numId="3" w16cid:durableId="1265697944">
-    <w:abstractNumId w:val="1"/>
   </w:num>
 </w:numbering>
 </file>
@@ -11625,7 +11625,7 @@
     <w:autoRedefine/>
     <w:uiPriority w:val="39"/>
     <w:unhideWhenUsed/>
-    <w:rsid w:val="00322B3E"/>
+    <w:rsid w:val="002B326A"/>
     <w:pPr>
       <w:spacing w:after="100"/>
     </w:pPr>
@@ -11637,7 +11637,7 @@
     <w:autoRedefine/>
     <w:uiPriority w:val="39"/>
     <w:unhideWhenUsed/>
-    <w:rsid w:val="00322B3E"/>
+    <w:rsid w:val="002B326A"/>
     <w:pPr>
       <w:spacing w:after="100"/>
       <w:ind w:left="240"/>
@@ -11650,7 +11650,7 @@
     <w:autoRedefine/>
     <w:uiPriority w:val="39"/>
     <w:unhideWhenUsed/>
-    <w:rsid w:val="00322B3E"/>
+    <w:rsid w:val="002B326A"/>
     <w:pPr>
       <w:spacing w:after="100"/>
       <w:ind w:left="480"/>

</xml_diff>